<commit_message>
Update document formatting to match template specifications
Correctly format index terms alphabetically, adjust reference citations to match template style, and add author information section.

Replit-Commit-Author: Agent
Replit-Commit-Session-Id: 107dae7e-f876-48e6-a450-5a6ed52c9042
Replit-Commit-Checkpoint-Type: full_checkpoint
Replit-Commit-Event-Id: f0be6c9f-c04b-4362-a336-ef57955ccbe5
Replit-Helium-Checkpoint-Created: true
</commit_message>
<xml_diff>
--- a/Gidan_LendingClub_CreditRisk_Paper.docx
+++ b/Gidan_LendingClub_CreditRisk_Paper.docx
@@ -134,7 +134,7 @@
           <w:i w:val="0"/>
           <w:sz w:val="20"/>
         </w:rPr>
-        <w:t xml:space="preserve"> - Credit Risk, Factor Analysis, Linear Discriminant Analysis, Logistic Regression, LendingClub.</w:t>
+        <w:t xml:space="preserve"> - Credit Risk, Factor Analysis, LendingClub, Linear Discriminant Analysis, Logistic Regression.</w:t>
       </w:r>
     </w:p>
     <w:p>
@@ -2455,8 +2455,8 @@
     </w:p>
     <w:p>
       <w:pPr>
-        <w:spacing w:line="240" w:lineRule="auto" w:before="0" w:after="80"/>
-        <w:ind w:left="360" w:hanging="360"/>
+        <w:spacing w:line="240" w:lineRule="auto" w:before="0" w:after="0"/>
+        <w:ind w:left="504" w:hanging="504"/>
         <w:jc w:val="both"/>
       </w:pPr>
       <w:r>
@@ -2466,13 +2466,15 @@
           <w:i w:val="0"/>
           <w:sz w:val="16"/>
         </w:rPr>
-        <w:t>[1] D. W. Hosmer and S. Lemeshow, Applied Logistic Regression, 2nd ed. New York, NY, USA: Wiley, 2000.</w:t>
+        <w:t>[1]</w:t>
+        <w:tab/>
+        <w:t>Hosmer, David W. and Lemeshow, Stanley. 2000. Applied Logistic Regression, 2nd ed. New York, NY: Wiley.</w:t>
       </w:r>
     </w:p>
     <w:p>
       <w:pPr>
-        <w:spacing w:line="240" w:lineRule="auto" w:before="0" w:after="80"/>
-        <w:ind w:left="360" w:hanging="360"/>
+        <w:spacing w:line="240" w:lineRule="auto" w:before="0" w:after="0"/>
+        <w:ind w:left="504" w:hanging="504"/>
         <w:jc w:val="both"/>
       </w:pPr>
       <w:r>
@@ -2482,13 +2484,15 @@
           <w:i w:val="0"/>
           <w:sz w:val="16"/>
         </w:rPr>
-        <w:t>[2] L. Breiman, "Random Forests," Machine Learning, vol. 45, no. 1, pp. 5-32, Oct. 2001.</w:t>
+        <w:t>[2]</w:t>
+        <w:tab/>
+        <w:t>Breiman, Leo. 2001. "Random Forests." Machine Learning, vol. 45, no. 1, pp. 5-32.</w:t>
       </w:r>
     </w:p>
     <w:p>
       <w:pPr>
-        <w:spacing w:line="240" w:lineRule="auto" w:before="0" w:after="80"/>
-        <w:ind w:left="360" w:hanging="360"/>
+        <w:spacing w:line="240" w:lineRule="auto" w:before="0" w:after="0"/>
+        <w:ind w:left="504" w:hanging="504"/>
         <w:jc w:val="both"/>
       </w:pPr>
       <w:r>
@@ -2498,13 +2502,15 @@
           <w:i w:val="0"/>
           <w:sz w:val="16"/>
         </w:rPr>
-        <w:t>[3] C. F. Tsai, Y. H. Hsu, and C. Yen, "A Comparative Study of Classifier Ensembles for Bankruptcy Prediction," Applied Soft Computing, vol. 24, pp. 977-984, Nov. 2014.</w:t>
+        <w:t>[3]</w:t>
+        <w:tab/>
+        <w:t>Tsai, Chih-Fong, Hsu, Yu-Feng, and Yen, David C. 2014. "A Comparative Study of Classifier Ensembles for Bankruptcy Prediction." Applied Soft Computing, vol. 24, pp. 977-984.</w:t>
       </w:r>
     </w:p>
     <w:p>
       <w:pPr>
-        <w:spacing w:line="240" w:lineRule="auto" w:before="0" w:after="80"/>
-        <w:ind w:left="360" w:hanging="360"/>
+        <w:spacing w:line="240" w:lineRule="auto" w:before="0" w:after="0"/>
+        <w:ind w:left="504" w:hanging="504"/>
         <w:jc w:val="both"/>
       </w:pPr>
       <w:r>
@@ -2514,13 +2520,15 @@
           <w:i w:val="0"/>
           <w:sz w:val="16"/>
         </w:rPr>
-        <w:t>[4] M. Malekipirbazari and V. Aksakalli, "Risk Assessment in Social Lending via Random Forests," Expert Systems with Applications, vol. 42, no. 10, pp. 4621-4631, Jun. 2015.</w:t>
+        <w:t>[4]</w:t>
+        <w:tab/>
+        <w:t>Malekipirbazari, Milad and Aksakalli, Vural. 2015. "Risk Assessment in Social Lending via Random Forests." Expert Systems with Applications, vol. 42, no. 10, pp. 4621-4631.</w:t>
       </w:r>
     </w:p>
     <w:p>
       <w:pPr>
-        <w:spacing w:line="240" w:lineRule="auto" w:before="0" w:after="80"/>
-        <w:ind w:left="360" w:hanging="360"/>
+        <w:spacing w:line="240" w:lineRule="auto" w:before="0" w:after="0"/>
+        <w:ind w:left="504" w:hanging="504"/>
         <w:jc w:val="both"/>
       </w:pPr>
       <w:r>
@@ -2530,13 +2538,15 @@
           <w:i w:val="0"/>
           <w:sz w:val="16"/>
         </w:rPr>
-        <w:t>[5] R. A. Johnson and D. W. Wichern, Applied Multivariate Statistical Analysis, 6th ed. Upper Saddle River, NJ, USA: Pearson, 2007.</w:t>
+        <w:t>[5]</w:t>
+        <w:tab/>
+        <w:t>Johnson, Richard A. and Wichern, Dean W. 2007. Applied Multivariate Statistical Analysis, 6th ed. Upper Saddle River, NJ: Pearson.</w:t>
       </w:r>
     </w:p>
     <w:p>
       <w:pPr>
-        <w:spacing w:line="240" w:lineRule="auto" w:before="0" w:after="80"/>
-        <w:ind w:left="360" w:hanging="360"/>
+        <w:spacing w:line="240" w:lineRule="auto" w:before="0" w:after="0"/>
+        <w:ind w:left="504" w:hanging="504"/>
         <w:jc w:val="both"/>
       </w:pPr>
       <w:r>
@@ -2546,13 +2556,15 @@
           <w:i w:val="0"/>
           <w:sz w:val="16"/>
         </w:rPr>
-        <w:t>[6] J. F. Hair, W. C. Black, B. J. Babin, and R. E. Anderson, Multivariate Data Analysis, 7th ed. Upper Saddle River, NJ, USA: Pearson, 2010.</w:t>
+        <w:t>[6]</w:t>
+        <w:tab/>
+        <w:t>Hair, Joseph F., Black, William C., Babin, Barry J., and Anderson, Rolph E. 2010. Multivariate Data Analysis, 7th ed. Upper Saddle River, NJ: Pearson.</w:t>
       </w:r>
     </w:p>
     <w:p>
       <w:pPr>
-        <w:spacing w:line="240" w:lineRule="auto" w:before="0" w:after="80"/>
-        <w:ind w:left="360" w:hanging="360"/>
+        <w:spacing w:line="240" w:lineRule="auto" w:before="0" w:after="0"/>
+        <w:ind w:left="504" w:hanging="504"/>
         <w:jc w:val="both"/>
       </w:pPr>
       <w:r>
@@ -2562,7 +2574,40 @@
           <w:i w:val="0"/>
           <w:sz w:val="16"/>
         </w:rPr>
-        <w:t>[7] LendingClub Loan Data, Kaggle, 2018. [Online]. Available: https://www.kaggle.com/datasets/wordsforthewise/lending-club</w:t>
+        <w:t>[7]</w:t>
+        <w:tab/>
+        <w:t>Wordsforthewise. 2018. LendingClub Loan Data. Kaggle. kaggle.com/datasets/wordsforthewise/lending-club. Accessed: March 2026.</w:t>
+      </w:r>
+    </w:p>
+    <w:p>
+      <w:pPr>
+        <w:spacing w:before="0" w:after="0" w:line="240" w:lineRule="auto"/>
+        <w:jc w:val="center"/>
+      </w:pPr>
+      <w:r>
+        <w:rPr>
+          <w:rFonts w:ascii="Times New Roman" w:hAnsi="Times New Roman"/>
+          <w:b/>
+          <w:i w:val="0"/>
+          <w:sz w:val="20"/>
+          <w:smallCaps/>
+        </w:rPr>
+        <w:t>. AUTHOR INFORMATION</w:t>
+      </w:r>
+    </w:p>
+    <w:p>
+      <w:pPr>
+        <w:spacing w:line="240" w:lineRule="auto" w:before="0" w:after="0"/>
+        <w:jc w:val="both"/>
+      </w:pPr>
+      <w:r>
+        <w:rPr>
+          <w:rFonts w:ascii="Times New Roman" w:hAnsi="Times New Roman"/>
+          <w:b w:val="0"/>
+          <w:i w:val="0"/>
+          <w:sz w:val="20"/>
+        </w:rPr>
+        <w:t>Lana Jalal Gidan is a graduate student in the Department of Systems Science and Industrial Engineering at Binghamton University, State University of New York. Her academic interests include applied statistics, machine learning, and data-driven decision making in financial and operational contexts. Contact: lgidan@binghamton.edu.</w:t>
       </w:r>
     </w:p>
     <w:sectPr>

</xml_diff>